<commit_message>
test: add API regression and strict-mode 503 tests; fix forum visibility and auth/data 503 handling
</commit_message>
<xml_diff>
--- a/docs/EduTrack中期汇报.docx
+++ b/docs/EduTrack中期汇报.docx
@@ -9,8 +9,13 @@
           <w:rFonts w:hint="eastAsia"/>
         </w:rPr>
       </w:pPr>
-      <w:r>
-        <w:t>EduTrack智能成绩管理与分析系统</w:t>
+      <w:proofErr w:type="spellStart"/>
+      <w:r>
+        <w:t>EduTrack</w:t>
+      </w:r>
+      <w:proofErr w:type="spellEnd"/>
+      <w:r>
+        <w:t>智能成绩管理与分析系统</w:t>
       </w:r>
     </w:p>
     <w:p>
@@ -67,7 +72,15 @@
         </w:rPr>
       </w:pPr>
       <w:r>
-        <w:t>本项目旨在开发一套智能化的学校成绩管理与分析系统，服务于学生、教师和管理员三类用户。截至目前，项目已完成从原有单文件HTML页面（约3700行代码）到现代化前后端分离架构的完整重构，主要进展如下：</w:t>
+        <w:t>本项目旨在开发一套智能化的学校成绩管理与分析系统，服务于学生、教师和管理员三类用户。截至目前，项目已完成从原有</w:t>
+      </w:r>
+      <w:proofErr w:type="gramStart"/>
+      <w:r>
+        <w:t>单文件</w:t>
+      </w:r>
+      <w:proofErr w:type="gramEnd"/>
+      <w:r>
+        <w:t>HTML页面（约3700行代码）到现代化前后端分离架构的完整重构，主要进展如下：</w:t>
       </w:r>
     </w:p>
     <w:p>
@@ -94,7 +107,15 @@
         </w:rPr>
       </w:pPr>
       <w:r>
-        <w:t>前端：采用 React 18 + TypeScript + Vite + Tailwind CSS 技术栈，实现组件化、类型安全的前端开发</w:t>
+        <w:t>前端：采用 React 18 + TypeScript + Vite + Tailwind CSS 技术</w:t>
+      </w:r>
+      <w:proofErr w:type="gramStart"/>
+      <w:r>
+        <w:t>栈</w:t>
+      </w:r>
+      <w:proofErr w:type="gramEnd"/>
+      <w:r>
+        <w:t>，实现组件化、类型安全的前端开发</w:t>
       </w:r>
     </w:p>
     <w:p>
@@ -924,7 +945,23 @@
                 <w:sz w:val="22"/>
                 <w:szCs w:val="22"/>
               </w:rPr>
-              <w:t>智学网风格Tab切换、全科/单科视图、排名信息</w:t>
+              <w:t>智</w:t>
+            </w:r>
+            <w:proofErr w:type="gramStart"/>
+            <w:r>
+              <w:rPr>
+                <w:sz w:val="22"/>
+                <w:szCs w:val="22"/>
+              </w:rPr>
+              <w:t>学网风格</w:t>
+            </w:r>
+            <w:proofErr w:type="gramEnd"/>
+            <w:r>
+              <w:rPr>
+                <w:sz w:val="22"/>
+                <w:szCs w:val="22"/>
+              </w:rPr>
+              <w:t>Tab切换、全科/单科视图、排名信息</w:t>
             </w:r>
           </w:p>
         </w:tc>
@@ -1024,12 +1061,21 @@
                 <w:rFonts w:hint="eastAsia"/>
               </w:rPr>
             </w:pPr>
-            <w:r>
-              <w:rPr>
-                <w:sz w:val="22"/>
-                <w:szCs w:val="22"/>
-              </w:rPr>
-              <w:t>ECharts折线图、排名变化、得分率趋势、科目雷达图</w:t>
+            <w:proofErr w:type="spellStart"/>
+            <w:r>
+              <w:rPr>
+                <w:sz w:val="22"/>
+                <w:szCs w:val="22"/>
+              </w:rPr>
+              <w:t>ECharts</w:t>
+            </w:r>
+            <w:proofErr w:type="spellEnd"/>
+            <w:r>
+              <w:rPr>
+                <w:sz w:val="22"/>
+                <w:szCs w:val="22"/>
+              </w:rPr>
+              <w:t>折线图、排名变化、得分率趋势、科目雷达图</w:t>
             </w:r>
           </w:p>
         </w:tc>
@@ -1132,8 +1178,17 @@
                 <w:sz w:val="22"/>
                 <w:szCs w:val="22"/>
               </w:rPr>
-              <w:t>目标分数设定、进度跟踪、达成率显示</w:t>
-            </w:r>
+              <w:t>目标分数设定、进度跟踪、达成</w:t>
+            </w:r>
+            <w:proofErr w:type="gramStart"/>
+            <w:r>
+              <w:rPr>
+                <w:sz w:val="22"/>
+                <w:szCs w:val="22"/>
+              </w:rPr>
+              <w:t>率显示</w:t>
+            </w:r>
+            <w:proofErr w:type="gramEnd"/>
           </w:p>
         </w:tc>
       </w:tr>
@@ -1505,7 +1560,39 @@
         <w:t>架构设计决定开发效率。</w:t>
       </w:r>
       <w:r>
-        <w:t>采用前后端分离架构，前端React组件化开发提升了代码复用率，后端RESTful API设计使接口职责清晰。特别是统一的布局组件（AdminLayout/StudentLayout/TeacherLayout）大幅减少了重复代码，提升了开发效率。</w:t>
+        <w:t>采用前后端分离架构，前端React组件</w:t>
+      </w:r>
+      <w:proofErr w:type="gramStart"/>
+      <w:r>
+        <w:t>化开发</w:t>
+      </w:r>
+      <w:proofErr w:type="gramEnd"/>
+      <w:r>
+        <w:t>提升了代码复用率，后端RESTful API设计使接口职责清晰。特别是统一的布局组件（</w:t>
+      </w:r>
+      <w:proofErr w:type="spellStart"/>
+      <w:r>
+        <w:t>AdminLayout</w:t>
+      </w:r>
+      <w:proofErr w:type="spellEnd"/>
+      <w:r>
+        <w:t>/</w:t>
+      </w:r>
+      <w:proofErr w:type="spellStart"/>
+      <w:r>
+        <w:t>StudentLayout</w:t>
+      </w:r>
+      <w:proofErr w:type="spellEnd"/>
+      <w:r>
+        <w:t>/</w:t>
+      </w:r>
+      <w:proofErr w:type="spellStart"/>
+      <w:r>
+        <w:t>TeacherLayout</w:t>
+      </w:r>
+      <w:proofErr w:type="spellEnd"/>
+      <w:r>
+        <w:t>）大幅减少了重复代码，提升了开发效率。</w:t>
       </w:r>
     </w:p>
     <w:p>
@@ -1548,10 +1635,58 @@
           <w:b/>
           <w:bCs/>
         </w:rPr>
-        <w:t>图表集成需注意生命周期管理。</w:t>
-      </w:r>
-      <w:r>
-        <w:t>开发中遇到ECharts图表不显示的问题，根因是图表实例重复初始化和React useEffect清理时机不当。通过封装getOrCreateChart工具函数复用已有实例，彻底解决了该问题。这让我们深刻认识到前端框架与第三方库集成时，生命周期管理的重要性。</w:t>
+        <w:t>图表</w:t>
+      </w:r>
+      <w:proofErr w:type="gramStart"/>
+      <w:r>
+        <w:rPr>
+          <w:b/>
+          <w:bCs/>
+        </w:rPr>
+        <w:t>集成需</w:t>
+      </w:r>
+      <w:proofErr w:type="gramEnd"/>
+      <w:r>
+        <w:rPr>
+          <w:b/>
+          <w:bCs/>
+        </w:rPr>
+        <w:t>注意生命周期管理。</w:t>
+      </w:r>
+      <w:r>
+        <w:t>开发中遇到</w:t>
+      </w:r>
+      <w:proofErr w:type="spellStart"/>
+      <w:r>
+        <w:t>ECharts</w:t>
+      </w:r>
+      <w:proofErr w:type="spellEnd"/>
+      <w:r>
+        <w:t xml:space="preserve">图表不显示的问题，根因是图表实例重复初始化和React </w:t>
+      </w:r>
+      <w:proofErr w:type="spellStart"/>
+      <w:r>
+        <w:t>useEffect</w:t>
+      </w:r>
+      <w:proofErr w:type="spellEnd"/>
+      <w:r>
+        <w:t>清理时机不当。通过封装</w:t>
+      </w:r>
+      <w:proofErr w:type="spellStart"/>
+      <w:r>
+        <w:t>getOrCreateChart</w:t>
+      </w:r>
+      <w:proofErr w:type="spellEnd"/>
+      <w:r>
+        <w:t>工具函数复用已有实例，彻底解决了该问题。这让我们深刻认识到前端框架与</w:t>
+      </w:r>
+      <w:proofErr w:type="gramStart"/>
+      <w:r>
+        <w:t>第三方库集成</w:t>
+      </w:r>
+      <w:proofErr w:type="gramEnd"/>
+      <w:r>
+        <w:t>时，生命周期管理的重要性。</w:t>
       </w:r>
     </w:p>
     <w:p>
@@ -1726,7 +1861,15 @@
         </w:rPr>
       </w:pPr>
       <w:r>
-        <w:t>开发校内在线论坛模块，支持发帖、回复、点赞等基本功能，为师生提供学习交流、经验分享、问题讨论的平台。论坛可按班级、科目进行分区讨论，同时支持匿名发帖，方便学生吐槽和真实反馈。</w:t>
+        <w:t>开发校内在线论坛模块，支持发帖、回复、</w:t>
+      </w:r>
+      <w:proofErr w:type="gramStart"/>
+      <w:r>
+        <w:t>点赞等</w:t>
+      </w:r>
+      <w:proofErr w:type="gramEnd"/>
+      <w:r>
+        <w:t>基本功能，为师生提供学习交流、经验分享、问题讨论的平台。论坛可按班级、科目进行分区讨论，同时支持匿名发帖，方便学生吐槽和真实反馈。</w:t>
       </w:r>
     </w:p>
     <w:p>
@@ -1779,7 +1922,15 @@
         </w:rPr>
       </w:pPr>
       <w:r>
-        <w:t>接入大语言模型（如通义千问、ChatGLM等），将系统中的成绩数据、班级信息、知识点关联等作为上下文输入大模型，实现基于数据的智能问答。三类用户均可受益：学生可询问“我哪科最弱”，教师可询问“班级数学成绩下降原因”，管理员可询问“全校平均分趋势”。</w:t>
+        <w:t>接入大语言模型（如通义千问、</w:t>
+      </w:r>
+      <w:proofErr w:type="spellStart"/>
+      <w:r>
+        <w:t>ChatGLM</w:t>
+      </w:r>
+      <w:proofErr w:type="spellEnd"/>
+      <w:r>
+        <w:t>等），将系统中的成绩数据、班级信息、知识点关联等作为上下文输入大模型，实现基于数据的智能问答。三类用户均可受益：学生可询问“我哪科最弱”，教师可询问“班级数学成绩下降原因”，管理员可询问“全校平均分趋势”。</w:t>
       </w:r>
     </w:p>
     <w:p>
@@ -1821,9 +1972,27 @@
           <w:rFonts w:hint="eastAsia"/>
         </w:rPr>
       </w:pPr>
-      <w:r>
-        <w:t>本项目已完成全栈架构重构与三大模块核心功能开发，实现成绩查询、趋势分析、进退步识别等功能，覆盖60个班级、3322名学生的真实数据。下阶段将重点推进在线考试、知识点分析、论坛和大模型智能问答四大功能。</w:t>
-      </w:r>
+      <w:bookmarkStart w:id="0" w:name="OLE_LINK1"/>
+      <w:r>
+        <w:t>本项目已完成全</w:t>
+      </w:r>
+      <w:proofErr w:type="gramStart"/>
+      <w:r>
+        <w:t>栈</w:t>
+      </w:r>
+      <w:proofErr w:type="gramEnd"/>
+      <w:r>
+        <w:t>架构重构与三大模块核心功能开发，实现成绩查询、趋势分析、进退步识别等功能，覆盖60个班级、3322名学生的真实数据。下阶段将重点推进在线考试、知识点分析、论坛和大模型智能</w:t>
+      </w:r>
+      <w:proofErr w:type="gramStart"/>
+      <w:r>
+        <w:t>问答四</w:t>
+      </w:r>
+      <w:proofErr w:type="gramEnd"/>
+      <w:r>
+        <w:t>大功能。</w:t>
+      </w:r>
+      <w:bookmarkEnd w:id="0"/>
     </w:p>
     <w:sectPr>
       <w:headerReference w:type="default" r:id="rId7"/>
@@ -1932,7 +2101,15 @@
         <w:sz w:val="18"/>
         <w:szCs w:val="18"/>
       </w:rPr>
-      <w:t xml:space="preserve"> 页</w:t>
+      <w:t xml:space="preserve"> </w:t>
+    </w:r>
+    <w:r>
+      <w:rPr>
+        <w:color w:val="999999"/>
+        <w:sz w:val="18"/>
+        <w:szCs w:val="18"/>
+      </w:rPr>
+      <w:t>页</w:t>
     </w:r>
   </w:p>
 </w:ftr>
@@ -1976,13 +2153,41 @@
         <w:rFonts w:hint="eastAsia"/>
       </w:rPr>
     </w:pPr>
+    <w:proofErr w:type="spellStart"/>
     <w:r>
       <w:rPr>
         <w:color w:val="999999"/>
         <w:sz w:val="18"/>
         <w:szCs w:val="18"/>
       </w:rPr>
-      <w:t>EduTrack智能成绩管理与分析系统 —— 大创项目中期汇报</w:t>
+      <w:t>EduTrack</w:t>
+    </w:r>
+    <w:proofErr w:type="spellEnd"/>
+    <w:r>
+      <w:rPr>
+        <w:color w:val="999999"/>
+        <w:sz w:val="18"/>
+        <w:szCs w:val="18"/>
+      </w:rPr>
+      <w:t>智能成绩管理与分析系统 —— 大</w:t>
+    </w:r>
+    <w:proofErr w:type="gramStart"/>
+    <w:r>
+      <w:rPr>
+        <w:color w:val="999999"/>
+        <w:sz w:val="18"/>
+        <w:szCs w:val="18"/>
+      </w:rPr>
+      <w:t>创项目</w:t>
+    </w:r>
+    <w:proofErr w:type="gramEnd"/>
+    <w:r>
+      <w:rPr>
+        <w:color w:val="999999"/>
+        <w:sz w:val="18"/>
+        <w:szCs w:val="18"/>
+      </w:rPr>
+      <w:t>中期汇报</w:t>
     </w:r>
   </w:p>
 </w:hdr>

</xml_diff>